<commit_message>
updates schedule, Sep 11 no chess
</commit_message>
<xml_diff>
--- a/docs/SWCC Summer-Fall 2025 Schedule.docx
+++ b/docs/SWCC Summer-Fall 2025 Schedule.docx
@@ -331,7 +331,9 @@
           <w:p>
             <w:pPr>
               <w:rPr>
-                <w:color w:val="0000FF"/>
+                <w:b/>
+                <w:bCs/>
+                <w:color w:val="FF0000"/>
                 <w:sz w:val="20"/>
                 <w:szCs w:val="20"/>
               </w:rPr>
@@ -340,12 +342,11 @@
               <w:rPr>
                 <w:b/>
                 <w:bCs/>
-                <w:spacing w:val="-4"/>
-                <w:w w:val="110"/>
-                <w:sz w:val="20"/>
-                <w:szCs w:val="20"/>
-              </w:rPr>
-              <w:t>Aug. 7</w:t>
+                <w:color w:val="EE0000"/>
+                <w:sz w:val="20"/>
+                <w:szCs w:val="20"/>
+              </w:rPr>
+              <w:t>Sep. 4</w:t>
             </w:r>
           </w:p>
         </w:tc>
@@ -363,7 +364,7 @@
             <w:pPr>
               <w:rPr>
                 <w:b/>
-                <w:color w:val="0000FF"/>
+                <w:color w:val="FF0000"/>
                 <w:sz w:val="20"/>
                 <w:szCs w:val="20"/>
               </w:rPr>
@@ -371,18 +372,11 @@
             <w:r>
               <w:rPr>
                 <w:b/>
-                <w:sz w:val="20"/>
-                <w:szCs w:val="20"/>
-              </w:rPr>
-              <w:t xml:space="preserve">Joe Crothers Memorial SWCC Chp – Rd </w:t>
-            </w:r>
-            <w:r>
-              <w:rPr>
-                <w:b/>
-                <w:sz w:val="20"/>
-                <w:szCs w:val="20"/>
-              </w:rPr>
-              <w:t>3</w:t>
+                <w:color w:val="FF0000"/>
+                <w:sz w:val="20"/>
+                <w:szCs w:val="20"/>
+              </w:rPr>
+              <w:t>No Chess – Village Hall Closed</w:t>
             </w:r>
           </w:p>
         </w:tc>
@@ -401,7 +395,7 @@
               <w:rPr>
                 <w:b/>
                 <w:bCs/>
-                <w:color w:val="385623" w:themeColor="accent6" w:themeShade="80"/>
+                <w:color w:val="C00000"/>
                 <w:sz w:val="20"/>
                 <w:szCs w:val="20"/>
               </w:rPr>
@@ -410,13 +404,31 @@
               <w:rPr>
                 <w:b/>
                 <w:bCs/>
-                <w:color w:val="385623" w:themeColor="accent6" w:themeShade="80"/>
-                <w:spacing w:val="-4"/>
-                <w:w w:val="110"/>
-                <w:sz w:val="20"/>
-                <w:szCs w:val="20"/>
-              </w:rPr>
-              <w:t>Oct. 2</w:t>
+                <w:color w:val="0000FF"/>
+                <w:sz w:val="20"/>
+                <w:szCs w:val="20"/>
+              </w:rPr>
+              <w:t>Oct</w:t>
+            </w:r>
+            <w:r>
+              <w:rPr>
+                <w:b/>
+                <w:bCs/>
+                <w:color w:val="0000FF"/>
+                <w:sz w:val="20"/>
+                <w:szCs w:val="20"/>
+              </w:rPr>
+              <w:t xml:space="preserve">. </w:t>
+            </w:r>
+            <w:r>
+              <w:rPr>
+                <w:b/>
+                <w:bCs/>
+                <w:color w:val="0000FF"/>
+                <w:sz w:val="20"/>
+                <w:szCs w:val="20"/>
+              </w:rPr>
+              <w:t>23</w:t>
             </w:r>
           </w:p>
         </w:tc>
@@ -435,7 +447,7 @@
               <w:rPr>
                 <w:b/>
                 <w:bCs/>
-                <w:color w:val="385623" w:themeColor="accent6" w:themeShade="80"/>
+                <w:color w:val="C00000"/>
                 <w:sz w:val="20"/>
                 <w:szCs w:val="20"/>
               </w:rPr>
@@ -444,11 +456,43 @@
               <w:rPr>
                 <w:b/>
                 <w:bCs/>
-                <w:color w:val="385623" w:themeColor="accent6" w:themeShade="80"/>
-                <w:sz w:val="20"/>
-                <w:szCs w:val="20"/>
-              </w:rPr>
-              <w:t>Speedy Gonzalez Action Swiss (3 rounds, one night)</w:t>
+                <w:color w:val="0000FF"/>
+                <w:sz w:val="20"/>
+                <w:szCs w:val="20"/>
+              </w:rPr>
+              <w:t xml:space="preserve">Bugs Bunny Blunders a Bishop </w:t>
+            </w:r>
+            <w:proofErr w:type="gramStart"/>
+            <w:r>
+              <w:rPr>
+                <w:b/>
+                <w:bCs/>
+                <w:color w:val="0000FF"/>
+                <w:sz w:val="20"/>
+                <w:szCs w:val="20"/>
+              </w:rPr>
+              <w:t>Swiss  -</w:t>
+            </w:r>
+            <w:proofErr w:type="gramEnd"/>
+            <w:r>
+              <w:rPr>
+                <w:b/>
+                <w:bCs/>
+                <w:color w:val="0000FF"/>
+                <w:sz w:val="20"/>
+                <w:szCs w:val="20"/>
+              </w:rPr>
+              <w:t xml:space="preserve"> Rd </w:t>
+            </w:r>
+            <w:r>
+              <w:rPr>
+                <w:b/>
+                <w:bCs/>
+                <w:color w:val="0000FF"/>
+                <w:sz w:val="20"/>
+                <w:szCs w:val="20"/>
+              </w:rPr>
+              <w:t>3</w:t>
             </w:r>
           </w:p>
         </w:tc>
@@ -470,7 +514,7 @@
           <w:p>
             <w:pPr>
               <w:rPr>
-                <w:color w:val="0000FF"/>
+                <w:color w:val="FF0000"/>
                 <w:sz w:val="20"/>
                 <w:szCs w:val="20"/>
               </w:rPr>
@@ -479,12 +523,11 @@
               <w:rPr>
                 <w:b/>
                 <w:bCs/>
-                <w:spacing w:val="-4"/>
-                <w:w w:val="110"/>
-                <w:sz w:val="20"/>
-                <w:szCs w:val="20"/>
-              </w:rPr>
-              <w:t>Aug. 14</w:t>
+                <w:color w:val="EE0000"/>
+                <w:sz w:val="20"/>
+                <w:szCs w:val="20"/>
+              </w:rPr>
+              <w:t>Sep. 11</w:t>
             </w:r>
           </w:p>
         </w:tc>
@@ -501,7 +544,7 @@
           <w:p>
             <w:pPr>
               <w:rPr>
-                <w:color w:val="0000FF"/>
+                <w:color w:val="FF0000"/>
                 <w:sz w:val="20"/>
                 <w:szCs w:val="20"/>
               </w:rPr>
@@ -509,18 +552,11 @@
             <w:r>
               <w:rPr>
                 <w:b/>
-                <w:sz w:val="20"/>
-                <w:szCs w:val="20"/>
-              </w:rPr>
-              <w:t xml:space="preserve">Joe Crothers Memorial SWCC Chp – Rd </w:t>
-            </w:r>
-            <w:r>
-              <w:rPr>
-                <w:b/>
-                <w:sz w:val="20"/>
-                <w:szCs w:val="20"/>
-              </w:rPr>
-              <w:t>4</w:t>
+                <w:color w:val="FF0000"/>
+                <w:sz w:val="20"/>
+                <w:szCs w:val="20"/>
+              </w:rPr>
+              <w:t>No Chess – Village Hall Closed</w:t>
             </w:r>
           </w:p>
         </w:tc>
@@ -539,7 +575,7 @@
               <w:rPr>
                 <w:b/>
                 <w:bCs/>
-                <w:color w:val="0000FF"/>
+                <w:color w:val="385623" w:themeColor="accent6" w:themeShade="80"/>
                 <w:sz w:val="20"/>
                 <w:szCs w:val="20"/>
                 <w:highlight w:val="yellow"/>
@@ -550,12 +586,30 @@
                 <w:b/>
                 <w:bCs/>
                 <w:color w:val="0000FF"/>
-                <w:spacing w:val="-4"/>
-                <w:w w:val="110"/>
-                <w:sz w:val="20"/>
-                <w:szCs w:val="20"/>
-              </w:rPr>
-              <w:t>Oct. 4</w:t>
+                <w:sz w:val="20"/>
+                <w:szCs w:val="20"/>
+              </w:rPr>
+              <w:t>Oct</w:t>
+            </w:r>
+            <w:r>
+              <w:rPr>
+                <w:b/>
+                <w:bCs/>
+                <w:color w:val="0000FF"/>
+                <w:sz w:val="20"/>
+                <w:szCs w:val="20"/>
+              </w:rPr>
+              <w:t xml:space="preserve">. </w:t>
+            </w:r>
+            <w:r>
+              <w:rPr>
+                <w:b/>
+                <w:bCs/>
+                <w:color w:val="0000FF"/>
+                <w:sz w:val="20"/>
+                <w:szCs w:val="20"/>
+              </w:rPr>
+              <w:t>30</w:t>
             </w:r>
           </w:p>
         </w:tc>
@@ -583,11 +637,44 @@
             <w:r>
               <w:rPr>
                 <w:b/>
+                <w:bCs/>
                 <w:color w:val="0000FF"/>
                 <w:sz w:val="20"/>
                 <w:szCs w:val="20"/>
               </w:rPr>
-              <w:t>Hales Corners Challenge XXXVII (Saturday)</w:t>
+              <w:t xml:space="preserve">Bugs Bunny Blunders a Bishop </w:t>
+            </w:r>
+            <w:proofErr w:type="gramStart"/>
+            <w:r>
+              <w:rPr>
+                <w:b/>
+                <w:bCs/>
+                <w:color w:val="0000FF"/>
+                <w:sz w:val="20"/>
+                <w:szCs w:val="20"/>
+              </w:rPr>
+              <w:t>Swiss  -</w:t>
+            </w:r>
+            <w:proofErr w:type="gramEnd"/>
+            <w:r>
+              <w:rPr>
+                <w:b/>
+                <w:bCs/>
+                <w:color w:val="0000FF"/>
+                <w:sz w:val="20"/>
+                <w:szCs w:val="20"/>
+              </w:rPr>
+              <w:t xml:space="preserve"> Rd </w:t>
+            </w:r>
+            <w:r>
+              <w:rPr>
+                <w:b/>
+                <w:bCs/>
+                <w:color w:val="0000FF"/>
+                <w:sz w:val="20"/>
+                <w:szCs w:val="20"/>
+              </w:rPr>
+              <w:t>4</w:t>
             </w:r>
           </w:p>
         </w:tc>
@@ -609,7 +696,7 @@
           <w:p>
             <w:pPr>
               <w:rPr>
-                <w:color w:val="0000FF"/>
+                <w:color w:val="EE0000"/>
                 <w:sz w:val="20"/>
                 <w:szCs w:val="20"/>
               </w:rPr>
@@ -623,7 +710,40 @@
                 <w:sz w:val="20"/>
                 <w:szCs w:val="20"/>
               </w:rPr>
-              <w:t>Aug. 21</w:t>
+              <w:t>Sep</w:t>
+            </w:r>
+            <w:r>
+              <w:rPr>
+                <w:b/>
+                <w:bCs/>
+                <w:spacing w:val="-4"/>
+                <w:w w:val="110"/>
+                <w:sz w:val="20"/>
+                <w:szCs w:val="20"/>
+              </w:rPr>
+              <w:t xml:space="preserve">. </w:t>
+            </w:r>
+            <w:r>
+              <w:rPr>
+                <w:b/>
+                <w:bCs/>
+                <w:spacing w:val="-4"/>
+                <w:w w:val="110"/>
+                <w:sz w:val="20"/>
+                <w:szCs w:val="20"/>
+              </w:rPr>
+              <w:t>1</w:t>
+            </w:r>
+            <w:r>
+              <w:rPr>
+                <w:b/>
+                <w:bCs/>
+                <w:spacing w:val="-4"/>
+                <w:w w:val="110"/>
+                <w:sz w:val="20"/>
+                <w:szCs w:val="20"/>
+              </w:rPr>
+              <w:t>8</w:t>
             </w:r>
           </w:p>
         </w:tc>
@@ -651,15 +771,33 @@
                 <w:sz w:val="20"/>
                 <w:szCs w:val="20"/>
               </w:rPr>
-              <w:t xml:space="preserve">Joe Crothers Memorial SWCC Chp – Rd </w:t>
-            </w:r>
-            <w:r>
-              <w:rPr>
-                <w:b/>
-                <w:sz w:val="20"/>
-                <w:szCs w:val="20"/>
-              </w:rPr>
-              <w:t>5</w:t>
+              <w:t xml:space="preserve">Joe Crothers Memorial SWCC </w:t>
+            </w:r>
+            <w:proofErr w:type="spellStart"/>
+            <w:r>
+              <w:rPr>
+                <w:b/>
+                <w:sz w:val="20"/>
+                <w:szCs w:val="20"/>
+              </w:rPr>
+              <w:t>Chp</w:t>
+            </w:r>
+            <w:proofErr w:type="spellEnd"/>
+            <w:r>
+              <w:rPr>
+                <w:b/>
+                <w:sz w:val="20"/>
+                <w:szCs w:val="20"/>
+              </w:rPr>
+              <w:t xml:space="preserve"> – Rd </w:t>
+            </w:r>
+            <w:r>
+              <w:rPr>
+                <w:b/>
+                <w:sz w:val="20"/>
+                <w:szCs w:val="20"/>
+              </w:rPr>
+              <w:t>4</w:t>
             </w:r>
           </w:p>
         </w:tc>
@@ -691,7 +829,7 @@
                 <w:sz w:val="20"/>
                 <w:szCs w:val="20"/>
               </w:rPr>
-              <w:t>Oct. 9</w:t>
+              <w:t>Nov. 6</w:t>
             </w:r>
           </w:p>
         </w:tc>
@@ -762,7 +900,7 @@
               <w:rPr>
                 <w:b/>
                 <w:bCs/>
-                <w:color w:val="0000FF"/>
+                <w:color w:val="EE0000"/>
                 <w:spacing w:val="-4"/>
                 <w:w w:val="110"/>
                 <w:sz w:val="20"/>
@@ -774,12 +912,21 @@
               <w:rPr>
                 <w:b/>
                 <w:bCs/>
-                <w:spacing w:val="-4"/>
-                <w:w w:val="110"/>
-                <w:sz w:val="20"/>
-                <w:szCs w:val="20"/>
-              </w:rPr>
-              <w:t>Aug. 28</w:t>
+                <w:color w:val="000000" w:themeColor="text1"/>
+                <w:sz w:val="20"/>
+                <w:szCs w:val="20"/>
+              </w:rPr>
+              <w:t xml:space="preserve">Sep. </w:t>
+            </w:r>
+            <w:r>
+              <w:rPr>
+                <w:b/>
+                <w:bCs/>
+                <w:color w:val="000000" w:themeColor="text1"/>
+                <w:sz w:val="20"/>
+                <w:szCs w:val="20"/>
+              </w:rPr>
+              <w:t>25</w:t>
             </w:r>
           </w:p>
         </w:tc>
@@ -809,15 +956,33 @@
                 <w:sz w:val="20"/>
                 <w:szCs w:val="20"/>
               </w:rPr>
-              <w:t xml:space="preserve">Joe Crothers Memorial SWCC Chp – Rd </w:t>
-            </w:r>
-            <w:r>
-              <w:rPr>
-                <w:b/>
-                <w:sz w:val="20"/>
-                <w:szCs w:val="20"/>
-              </w:rPr>
-              <w:t>6</w:t>
+              <w:t xml:space="preserve">Joe Crothers Memorial SWCC </w:t>
+            </w:r>
+            <w:proofErr w:type="spellStart"/>
+            <w:r>
+              <w:rPr>
+                <w:b/>
+                <w:sz w:val="20"/>
+                <w:szCs w:val="20"/>
+              </w:rPr>
+              <w:t>Chp</w:t>
+            </w:r>
+            <w:proofErr w:type="spellEnd"/>
+            <w:r>
+              <w:rPr>
+                <w:b/>
+                <w:sz w:val="20"/>
+                <w:szCs w:val="20"/>
+              </w:rPr>
+              <w:t xml:space="preserve"> – Rd </w:t>
+            </w:r>
+            <w:r>
+              <w:rPr>
+                <w:b/>
+                <w:sz w:val="20"/>
+                <w:szCs w:val="20"/>
+              </w:rPr>
+              <w:t>5</w:t>
             </w:r>
           </w:p>
         </w:tc>
@@ -853,7 +1018,7 @@
                 <w:sz w:val="20"/>
                 <w:szCs w:val="20"/>
               </w:rPr>
-              <w:t>Oct. 16</w:t>
+              <w:t>Nov. 13</w:t>
             </w:r>
           </w:p>
         </w:tc>
@@ -925,7 +1090,7 @@
               <w:rPr>
                 <w:b/>
                 <w:bCs/>
-                <w:color w:val="0000FF"/>
+                <w:color w:val="EE0000"/>
                 <w:sz w:val="20"/>
                 <w:szCs w:val="20"/>
               </w:rPr>
@@ -934,11 +1099,31 @@
               <w:rPr>
                 <w:b/>
                 <w:bCs/>
-                <w:color w:val="0000FF"/>
-                <w:sz w:val="20"/>
-                <w:szCs w:val="20"/>
-              </w:rPr>
-              <w:t>Sep. 4</w:t>
+                <w:color w:val="000000" w:themeColor="text1"/>
+                <w:sz w:val="20"/>
+                <w:szCs w:val="20"/>
+              </w:rPr>
+              <w:t>Oct</w:t>
+            </w:r>
+            <w:r>
+              <w:rPr>
+                <w:b/>
+                <w:bCs/>
+                <w:color w:val="000000" w:themeColor="text1"/>
+                <w:sz w:val="20"/>
+                <w:szCs w:val="20"/>
+              </w:rPr>
+              <w:t xml:space="preserve">. </w:t>
+            </w:r>
+            <w:r>
+              <w:rPr>
+                <w:b/>
+                <w:bCs/>
+                <w:color w:val="000000" w:themeColor="text1"/>
+                <w:sz w:val="20"/>
+                <w:szCs w:val="20"/>
+              </w:rPr>
+              <w:t>2</w:t>
             </w:r>
           </w:p>
         </w:tc>
@@ -965,12 +1150,36 @@
             <w:r>
               <w:rPr>
                 <w:b/>
-                <w:bCs/>
-                <w:color w:val="0000FF"/>
-                <w:sz w:val="20"/>
-                <w:szCs w:val="20"/>
-              </w:rPr>
-              <w:t>Bugs Bunny Blunders a Bishop Swiss  - Rd 1</w:t>
+                <w:sz w:val="20"/>
+                <w:szCs w:val="20"/>
+              </w:rPr>
+              <w:t xml:space="preserve">Joe Crothers Memorial SWCC </w:t>
+            </w:r>
+            <w:proofErr w:type="spellStart"/>
+            <w:r>
+              <w:rPr>
+                <w:b/>
+                <w:sz w:val="20"/>
+                <w:szCs w:val="20"/>
+              </w:rPr>
+              <w:t>Chp</w:t>
+            </w:r>
+            <w:proofErr w:type="spellEnd"/>
+            <w:r>
+              <w:rPr>
+                <w:b/>
+                <w:sz w:val="20"/>
+                <w:szCs w:val="20"/>
+              </w:rPr>
+              <w:t xml:space="preserve"> – Rd </w:t>
+            </w:r>
+            <w:r>
+              <w:rPr>
+                <w:b/>
+                <w:sz w:val="20"/>
+                <w:szCs w:val="20"/>
+              </w:rPr>
+              <w:t>6</w:t>
             </w:r>
           </w:p>
         </w:tc>
@@ -1001,19 +1210,7 @@
                 <w:sz w:val="20"/>
                 <w:szCs w:val="20"/>
               </w:rPr>
-              <w:t xml:space="preserve">Oct. </w:t>
-            </w:r>
-            <w:r>
-              <w:rPr>
-                <w:b/>
-                <w:bCs/>
-                <w:color w:val="7030A0"/>
-                <w:spacing w:val="-4"/>
-                <w:w w:val="110"/>
-                <w:sz w:val="20"/>
-                <w:szCs w:val="20"/>
-              </w:rPr>
-              <w:t>23</w:t>
+              <w:t>Nov. 20</w:t>
             </w:r>
           </w:p>
         </w:tc>
@@ -1095,11 +1292,13 @@
               <w:rPr>
                 <w:b/>
                 <w:bCs/>
-                <w:color w:val="0000FF"/>
-                <w:sz w:val="20"/>
-                <w:szCs w:val="20"/>
-              </w:rPr>
-              <w:t>Sep. 11</w:t>
+                <w:color w:val="C00000"/>
+                <w:spacing w:val="-4"/>
+                <w:w w:val="110"/>
+                <w:sz w:val="20"/>
+                <w:szCs w:val="20"/>
+              </w:rPr>
+              <w:t>Oct. 4</w:t>
             </w:r>
           </w:p>
         </w:tc>
@@ -1125,12 +1324,11 @@
             <w:r>
               <w:rPr>
                 <w:b/>
-                <w:bCs/>
-                <w:color w:val="0000FF"/>
-                <w:sz w:val="20"/>
-                <w:szCs w:val="20"/>
-              </w:rPr>
-              <w:t>Bugs Bunny Blunders a Bishop Swiss  - Rd 2</w:t>
+                <w:color w:val="C00000"/>
+                <w:sz w:val="20"/>
+                <w:szCs w:val="20"/>
+              </w:rPr>
+              <w:t>Hales Corners Challenge XXXVII (Saturday)</w:t>
             </w:r>
           </w:p>
         </w:tc>
@@ -1166,7 +1364,7 @@
                 <w:sz w:val="20"/>
                 <w:szCs w:val="20"/>
               </w:rPr>
-              <w:t>Oct. 30</w:t>
+              <w:t>Dec. 4</w:t>
             </w:r>
           </w:p>
         </w:tc>
@@ -1251,7 +1449,27 @@
                 <w:sz w:val="20"/>
                 <w:szCs w:val="20"/>
               </w:rPr>
-              <w:t>Sep. 18</w:t>
+              <w:t>Oct</w:t>
+            </w:r>
+            <w:r>
+              <w:rPr>
+                <w:b/>
+                <w:bCs/>
+                <w:color w:val="0000FF"/>
+                <w:sz w:val="20"/>
+                <w:szCs w:val="20"/>
+              </w:rPr>
+              <w:t xml:space="preserve">. </w:t>
+            </w:r>
+            <w:r>
+              <w:rPr>
+                <w:b/>
+                <w:bCs/>
+                <w:color w:val="0000FF"/>
+                <w:sz w:val="20"/>
+                <w:szCs w:val="20"/>
+              </w:rPr>
+              <w:t>9</w:t>
             </w:r>
           </w:p>
         </w:tc>
@@ -1281,7 +1499,39 @@
                 <w:sz w:val="20"/>
                 <w:szCs w:val="20"/>
               </w:rPr>
-              <w:t>Bugs Bunny Blunders a Bishop Swiss  - Rd 3</w:t>
+              <w:t xml:space="preserve">Bugs Bunny Blunders a Bishop </w:t>
+            </w:r>
+            <w:proofErr w:type="gramStart"/>
+            <w:r>
+              <w:rPr>
+                <w:b/>
+                <w:bCs/>
+                <w:color w:val="0000FF"/>
+                <w:sz w:val="20"/>
+                <w:szCs w:val="20"/>
+              </w:rPr>
+              <w:t>Swiss  -</w:t>
+            </w:r>
+            <w:proofErr w:type="gramEnd"/>
+            <w:r>
+              <w:rPr>
+                <w:b/>
+                <w:bCs/>
+                <w:color w:val="0000FF"/>
+                <w:sz w:val="20"/>
+                <w:szCs w:val="20"/>
+              </w:rPr>
+              <w:t xml:space="preserve"> Rd </w:t>
+            </w:r>
+            <w:r>
+              <w:rPr>
+                <w:b/>
+                <w:bCs/>
+                <w:color w:val="0000FF"/>
+                <w:sz w:val="20"/>
+                <w:szCs w:val="20"/>
+              </w:rPr>
+              <w:t>1</w:t>
             </w:r>
           </w:p>
         </w:tc>
@@ -1311,13 +1561,37 @@
               <w:rPr>
                 <w:b/>
                 <w:bCs/>
-                <w:color w:val="7030A0"/>
+                <w:color w:val="0000FF"/>
                 <w:spacing w:val="-4"/>
                 <w:w w:val="110"/>
-                <w:sz w:val="20"/>
-                <w:szCs w:val="20"/>
-              </w:rPr>
-              <w:t>Nov. 6</w:t>
+                <w:sz w:val="18"/>
+                <w:szCs w:val="18"/>
+              </w:rPr>
+              <w:t>Dec</w:t>
+            </w:r>
+            <w:r>
+              <w:rPr>
+                <w:b/>
+                <w:bCs/>
+                <w:color w:val="0000FF"/>
+                <w:spacing w:val="-4"/>
+                <w:w w:val="110"/>
+                <w:sz w:val="18"/>
+                <w:szCs w:val="18"/>
+              </w:rPr>
+              <w:t xml:space="preserve">. </w:t>
+            </w:r>
+            <w:r>
+              <w:rPr>
+                <w:b/>
+                <w:bCs/>
+                <w:color w:val="0000FF"/>
+                <w:spacing w:val="-4"/>
+                <w:w w:val="110"/>
+                <w:sz w:val="18"/>
+                <w:szCs w:val="18"/>
+              </w:rPr>
+              <w:t>11</w:t>
             </w:r>
           </w:p>
         </w:tc>
@@ -1344,29 +1618,11 @@
             <w:r>
               <w:rPr>
                 <w:b/>
-                <w:color w:val="7030A0"/>
-                <w:sz w:val="20"/>
-                <w:szCs w:val="20"/>
-              </w:rPr>
-              <w:t>Garfield Gambits a Pawn Swiss</w:t>
-            </w:r>
-            <w:r>
-              <w:rPr>
-                <w:b/>
-                <w:color w:val="7030A0"/>
-                <w:sz w:val="20"/>
-                <w:szCs w:val="20"/>
-              </w:rPr>
-              <w:t xml:space="preserve"> – Rd </w:t>
-            </w:r>
-            <w:r>
-              <w:rPr>
-                <w:b/>
-                <w:color w:val="7030A0"/>
-                <w:sz w:val="20"/>
-                <w:szCs w:val="20"/>
-              </w:rPr>
-              <w:t>5</w:t>
+                <w:color w:val="0000FF"/>
+                <w:sz w:val="20"/>
+                <w:szCs w:val="20"/>
+              </w:rPr>
+              <w:t>Quasimodo Sacks a Queen Swiss – Rd 1</w:t>
             </w:r>
           </w:p>
         </w:tc>
@@ -1403,7 +1659,27 @@
                 <w:sz w:val="20"/>
                 <w:szCs w:val="20"/>
               </w:rPr>
-              <w:t>Sep. 25</w:t>
+              <w:t>Oct</w:t>
+            </w:r>
+            <w:r>
+              <w:rPr>
+                <w:b/>
+                <w:bCs/>
+                <w:color w:val="0000FF"/>
+                <w:sz w:val="20"/>
+                <w:szCs w:val="20"/>
+              </w:rPr>
+              <w:t>. 1</w:t>
+            </w:r>
+            <w:r>
+              <w:rPr>
+                <w:b/>
+                <w:bCs/>
+                <w:color w:val="0000FF"/>
+                <w:sz w:val="20"/>
+                <w:szCs w:val="20"/>
+              </w:rPr>
+              <w:t>6</w:t>
             </w:r>
           </w:p>
         </w:tc>
@@ -1433,7 +1709,39 @@
                 <w:sz w:val="20"/>
                 <w:szCs w:val="20"/>
               </w:rPr>
-              <w:t>Bugs Bunny Blunders a Bishop Swiss  - Rd 4</w:t>
+              <w:t xml:space="preserve">Bugs Bunny Blunders a Bishop </w:t>
+            </w:r>
+            <w:proofErr w:type="gramStart"/>
+            <w:r>
+              <w:rPr>
+                <w:b/>
+                <w:bCs/>
+                <w:color w:val="0000FF"/>
+                <w:sz w:val="20"/>
+                <w:szCs w:val="20"/>
+              </w:rPr>
+              <w:t>Swiss  -</w:t>
+            </w:r>
+            <w:proofErr w:type="gramEnd"/>
+            <w:r>
+              <w:rPr>
+                <w:b/>
+                <w:bCs/>
+                <w:color w:val="0000FF"/>
+                <w:sz w:val="20"/>
+                <w:szCs w:val="20"/>
+              </w:rPr>
+              <w:t xml:space="preserve"> Rd </w:t>
+            </w:r>
+            <w:r>
+              <w:rPr>
+                <w:b/>
+                <w:bCs/>
+                <w:color w:val="0000FF"/>
+                <w:sz w:val="20"/>
+                <w:szCs w:val="20"/>
+              </w:rPr>
+              <w:t>2</w:t>
             </w:r>
           </w:p>
         </w:tc>
@@ -1469,7 +1777,43 @@
                 <w:sz w:val="18"/>
                 <w:szCs w:val="18"/>
               </w:rPr>
-              <w:t>Nov. 13</w:t>
+              <w:t>Dec</w:t>
+            </w:r>
+            <w:r>
+              <w:rPr>
+                <w:b/>
+                <w:bCs/>
+                <w:color w:val="0000FF"/>
+                <w:spacing w:val="-4"/>
+                <w:w w:val="110"/>
+                <w:sz w:val="18"/>
+                <w:szCs w:val="18"/>
+              </w:rPr>
+              <w:t xml:space="preserve">. </w:t>
+            </w:r>
+            <w:r>
+              <w:rPr>
+                <w:b/>
+                <w:bCs/>
+                <w:color w:val="0000FF"/>
+                <w:spacing w:val="-4"/>
+                <w:w w:val="110"/>
+                <w:sz w:val="18"/>
+                <w:szCs w:val="18"/>
+              </w:rPr>
+              <w:t>1</w:t>
+            </w:r>
+            <w:r>
+              <w:rPr>
+                <w:b/>
+                <w:bCs/>
+                <w:color w:val="0000FF"/>
+                <w:spacing w:val="-4"/>
+                <w:w w:val="110"/>
+                <w:sz w:val="18"/>
+                <w:szCs w:val="18"/>
+              </w:rPr>
+              <w:t>8</w:t>
             </w:r>
           </w:p>
         </w:tc>
@@ -1499,7 +1843,16 @@
                 <w:sz w:val="20"/>
                 <w:szCs w:val="20"/>
               </w:rPr>
-              <w:t>Quasimodo Sacks a Queen Swiss – Rd 1</w:t>
+              <w:t xml:space="preserve">Quasimodo Sacks a Queen Swiss – Rd </w:t>
+            </w:r>
+            <w:r>
+              <w:rPr>
+                <w:b/>
+                <w:color w:val="0000FF"/>
+                <w:sz w:val="20"/>
+                <w:szCs w:val="20"/>
+              </w:rPr>
+              <w:t>2</w:t>
             </w:r>
           </w:p>
         </w:tc>
@@ -2324,6 +2677,7 @@
         </w:rPr>
         <w:t>noted as follows: A Game/</w:t>
       </w:r>
+      <w:proofErr w:type="gramStart"/>
       <w:r>
         <w:rPr>
           <w:b/>
@@ -2350,7 +2704,22 @@
           <w:sz w:val="22"/>
           <w:szCs w:val="22"/>
         </w:rPr>
-        <w:t xml:space="preserve">0 minute event with a 5-second delay is </w:t>
+        <w:t>0 minute</w:t>
+      </w:r>
+      <w:proofErr w:type="gramEnd"/>
+      <w:r>
+        <w:rPr>
+          <w:b/>
+          <w:bCs/>
+          <w:i/>
+          <w:iCs/>
+          <w:color w:val="6F2F9F"/>
+          <w:spacing w:val="-10"/>
+          <w:w w:val="115"/>
+          <w:sz w:val="22"/>
+          <w:szCs w:val="22"/>
+        </w:rPr>
+        <w:t xml:space="preserve"> event with a 5-second delay is </w:t>
       </w:r>
       <w:r>
         <w:rPr>
@@ -2366,6 +2735,7 @@
         </w:rPr>
         <w:t>abbreviated as G/</w:t>
       </w:r>
+      <w:proofErr w:type="gramStart"/>
       <w:r>
         <w:rPr>
           <w:b/>
@@ -2392,7 +2762,22 @@
           <w:sz w:val="22"/>
           <w:szCs w:val="22"/>
         </w:rPr>
-        <w:t>0;d5.</w:t>
+        <w:t>0;d</w:t>
+      </w:r>
+      <w:proofErr w:type="gramEnd"/>
+      <w:r>
+        <w:rPr>
+          <w:b/>
+          <w:bCs/>
+          <w:i/>
+          <w:iCs/>
+          <w:color w:val="6F2F9F"/>
+          <w:spacing w:val="-12"/>
+          <w:w w:val="115"/>
+          <w:sz w:val="22"/>
+          <w:szCs w:val="22"/>
+        </w:rPr>
+        <w:t>5.</w:t>
       </w:r>
     </w:p>
     <w:p>
@@ -2671,6 +3056,21 @@
           <w:t>http://www.southwestchessclub.com/</w:t>
         </w:r>
       </w:hyperlink>
+    </w:p>
+    <w:p>
+      <w:pPr>
+        <w:spacing w:before="396"/>
+        <w:jc w:val="both"/>
+        <w:rPr>
+          <w:b/>
+          <w:bCs/>
+          <w:color w:val="974706"/>
+          <w:spacing w:val="-4"/>
+          <w:w w:val="105"/>
+          <w:sz w:val="22"/>
+          <w:szCs w:val="22"/>
+        </w:rPr>
+      </w:pPr>
     </w:p>
     <w:p>
       <w:pPr>
@@ -2977,113 +3377,263 @@
           <w:szCs w:val="22"/>
           <w:u w:val="single"/>
         </w:rPr>
+        <w:t xml:space="preserve">, </w:t>
+      </w:r>
+      <w:r>
+        <w:rPr>
+          <w:b/>
+          <w:sz w:val="22"/>
+          <w:szCs w:val="22"/>
+          <w:u w:val="single"/>
+        </w:rPr>
+        <w:t xml:space="preserve">August </w:t>
+      </w:r>
+      <w:r>
+        <w:rPr>
+          <w:b/>
+          <w:sz w:val="22"/>
+          <w:szCs w:val="22"/>
+          <w:u w:val="single"/>
+        </w:rPr>
+        <w:t xml:space="preserve">7, </w:t>
+      </w:r>
+      <w:r>
+        <w:rPr>
+          <w:b/>
+          <w:sz w:val="22"/>
+          <w:szCs w:val="22"/>
+          <w:u w:val="single"/>
+        </w:rPr>
+        <w:t xml:space="preserve">September </w:t>
+      </w:r>
+      <w:r>
+        <w:rPr>
+          <w:b/>
+          <w:sz w:val="22"/>
+          <w:szCs w:val="22"/>
+          <w:u w:val="single"/>
+        </w:rPr>
+        <w:t>18</w:t>
+      </w:r>
+      <w:r>
+        <w:rPr>
+          <w:b/>
+          <w:sz w:val="22"/>
+          <w:szCs w:val="22"/>
+          <w:u w:val="single"/>
+        </w:rPr>
+        <w:t xml:space="preserve">, </w:t>
+      </w:r>
+      <w:r>
+        <w:rPr>
+          <w:b/>
+          <w:sz w:val="22"/>
+          <w:szCs w:val="22"/>
+          <w:u w:val="single"/>
+        </w:rPr>
+        <w:t>25, &amp; October 2</w:t>
+      </w:r>
+    </w:p>
+    <w:p>
+      <w:pPr>
+        <w:rPr>
+          <w:b/>
+          <w:bCs/>
+          <w:sz w:val="22"/>
+          <w:szCs w:val="22"/>
+        </w:rPr>
+      </w:pPr>
+      <w:r>
+        <w:rPr>
+          <w:sz w:val="22"/>
+          <w:szCs w:val="22"/>
+        </w:rPr>
+        <w:t>6-Round Swiss in One Section. Game/</w:t>
+      </w:r>
+      <w:proofErr w:type="gramStart"/>
+      <w:r>
+        <w:rPr>
+          <w:sz w:val="22"/>
+          <w:szCs w:val="22"/>
+        </w:rPr>
+        <w:t>90;d</w:t>
+      </w:r>
+      <w:proofErr w:type="gramEnd"/>
+      <w:r>
+        <w:rPr>
+          <w:sz w:val="22"/>
+          <w:szCs w:val="22"/>
+        </w:rPr>
+        <w:t>5. USCF Rated. EF: $10.00 (must be a member to participate). SWCC membership $10 (can join prior to first round). (Two ½-point byes available in rounds 1 through 5, if requested at least 2-days in advance).  TD is Grochowski; ATD is Wainscott</w:t>
+      </w:r>
+      <w:proofErr w:type="gramStart"/>
+      <w:r>
+        <w:rPr>
+          <w:sz w:val="22"/>
+          <w:szCs w:val="22"/>
+        </w:rPr>
+        <w:t xml:space="preserve">  </w:t>
+      </w:r>
+      <w:r>
+        <w:rPr>
+          <w:color w:val="FF0000"/>
+          <w:sz w:val="22"/>
+          <w:szCs w:val="22"/>
+        </w:rPr>
         <w:t xml:space="preserve"> </w:t>
       </w:r>
       <w:r>
         <w:rPr>
           <w:b/>
-          <w:sz w:val="22"/>
-          <w:szCs w:val="22"/>
-          <w:u w:val="single"/>
-        </w:rPr>
-        <w:t>&amp; August 7, 14</w:t>
-      </w:r>
-      <w:r>
-        <w:rPr>
-          <w:b/>
-          <w:sz w:val="22"/>
-          <w:szCs w:val="22"/>
-          <w:u w:val="single"/>
-        </w:rPr>
-        <w:t>,</w:t>
-      </w:r>
-      <w:r>
-        <w:rPr>
-          <w:b/>
-          <w:sz w:val="22"/>
-          <w:szCs w:val="22"/>
-          <w:u w:val="single"/>
-        </w:rPr>
-        <w:t xml:space="preserve"> 21</w:t>
-      </w:r>
-      <w:r>
-        <w:rPr>
-          <w:b/>
-          <w:sz w:val="22"/>
-          <w:szCs w:val="22"/>
-          <w:u w:val="single"/>
-        </w:rPr>
-        <w:t>, &amp; 28</w:t>
-      </w:r>
-    </w:p>
-    <w:p>
-      <w:pPr>
-        <w:rPr>
-          <w:b/>
-          <w:bCs/>
-          <w:sz w:val="22"/>
-          <w:szCs w:val="22"/>
-        </w:rPr>
-      </w:pPr>
-      <w:r>
-        <w:rPr>
-          <w:sz w:val="22"/>
-          <w:szCs w:val="22"/>
-        </w:rPr>
-        <w:t xml:space="preserve">6-Round Swiss in One Section. Game/90;d5. USCF Rated. EF: $10.00 (must be a member to participate). SWCC membership $10 (can join prior to first round). (Two ½-point byes available in rounds 1 through 5, if requested at least 2-days in advance).  TD is Grochowski; ATD is Wainscott  </w:t>
-      </w:r>
-      <w:r>
-        <w:rPr>
+          <w:bCs/>
           <w:color w:val="FF0000"/>
           <w:sz w:val="22"/>
           <w:szCs w:val="22"/>
         </w:rPr>
+        <w:t>(</w:t>
+      </w:r>
+      <w:proofErr w:type="gramEnd"/>
+      <w:r>
+        <w:rPr>
+          <w:b/>
+          <w:bCs/>
+          <w:color w:val="FF0000"/>
+          <w:sz w:val="22"/>
+          <w:szCs w:val="22"/>
+        </w:rPr>
+        <w:t>NOTE: No Chess on July 31</w:t>
+      </w:r>
+      <w:r>
+        <w:rPr>
+          <w:b/>
+          <w:bCs/>
+          <w:color w:val="FF0000"/>
+          <w:sz w:val="22"/>
+          <w:szCs w:val="22"/>
+          <w:vertAlign w:val="superscript"/>
+        </w:rPr>
+        <w:t>st</w:t>
+      </w:r>
+      <w:r>
+        <w:rPr>
+          <w:b/>
+          <w:bCs/>
+          <w:color w:val="FF0000"/>
+          <w:sz w:val="22"/>
+          <w:szCs w:val="22"/>
+        </w:rPr>
+        <w:t>)</w:t>
+      </w:r>
+    </w:p>
+    <w:p>
+      <w:pPr>
+        <w:rPr>
+          <w:sz w:val="22"/>
+          <w:szCs w:val="22"/>
+        </w:rPr>
+      </w:pPr>
+    </w:p>
+    <w:p>
+      <w:pPr>
+        <w:rPr>
+          <w:bCs/>
+          <w:color w:val="0000FF"/>
+          <w:sz w:val="22"/>
+          <w:szCs w:val="22"/>
+        </w:rPr>
+      </w:pPr>
+      <w:r>
+        <w:rPr>
+          <w:b/>
+          <w:bCs/>
+          <w:color w:val="0000FF"/>
+          <w:sz w:val="22"/>
+          <w:szCs w:val="22"/>
+          <w:u w:val="single"/>
+        </w:rPr>
+        <w:t xml:space="preserve">Bugs Bunny Blunders a Bishop Swiss: </w:t>
+      </w:r>
+      <w:r>
+        <w:rPr>
+          <w:b/>
+          <w:bCs/>
+          <w:color w:val="0000FF"/>
+          <w:sz w:val="22"/>
+          <w:szCs w:val="22"/>
+          <w:u w:val="single"/>
+        </w:rPr>
+        <w:t xml:space="preserve">October </w:t>
+      </w:r>
+      <w:r>
+        <w:rPr>
+          <w:b/>
+          <w:bCs/>
+          <w:color w:val="0000FF"/>
+          <w:sz w:val="22"/>
+          <w:szCs w:val="22"/>
+          <w:u w:val="single"/>
+        </w:rPr>
+        <w:t>9</w:t>
+      </w:r>
+      <w:r>
+        <w:rPr>
+          <w:b/>
+          <w:bCs/>
+          <w:color w:val="0000FF"/>
+          <w:sz w:val="22"/>
+          <w:szCs w:val="22"/>
+          <w:u w:val="single"/>
+        </w:rPr>
+        <w:t xml:space="preserve">, </w:t>
+      </w:r>
+      <w:r>
+        <w:rPr>
+          <w:b/>
+          <w:bCs/>
+          <w:color w:val="0000FF"/>
+          <w:sz w:val="22"/>
+          <w:szCs w:val="22"/>
+          <w:u w:val="single"/>
+        </w:rPr>
+        <w:t xml:space="preserve">16, </w:t>
+      </w:r>
+      <w:r>
+        <w:rPr>
+          <w:b/>
+          <w:bCs/>
+          <w:color w:val="0000FF"/>
+          <w:sz w:val="22"/>
+          <w:szCs w:val="22"/>
+          <w:u w:val="single"/>
+        </w:rPr>
+        <w:t>2</w:t>
+      </w:r>
+      <w:r>
+        <w:rPr>
+          <w:b/>
+          <w:bCs/>
+          <w:color w:val="0000FF"/>
+          <w:sz w:val="22"/>
+          <w:szCs w:val="22"/>
+          <w:u w:val="single"/>
+        </w:rPr>
+        <w:t>3, 30</w:t>
+      </w:r>
+      <w:r>
+        <w:rPr>
+          <w:b/>
+          <w:bCs/>
+          <w:color w:val="0000FF"/>
+          <w:sz w:val="22"/>
+          <w:szCs w:val="22"/>
+          <w:u w:val="single"/>
+        </w:rPr>
         <w:t xml:space="preserve"> </w:t>
       </w:r>
-      <w:r>
-        <w:rPr>
-          <w:b/>
-          <w:bCs/>
-          <w:color w:val="FF0000"/>
-          <w:sz w:val="22"/>
-          <w:szCs w:val="22"/>
-        </w:rPr>
-        <w:t>(NOTE: No Chess on July 31</w:t>
-      </w:r>
-      <w:r>
-        <w:rPr>
-          <w:b/>
-          <w:bCs/>
-          <w:color w:val="FF0000"/>
-          <w:sz w:val="22"/>
-          <w:szCs w:val="22"/>
-          <w:vertAlign w:val="superscript"/>
-        </w:rPr>
-        <w:t>st</w:t>
-      </w:r>
-      <w:r>
-        <w:rPr>
-          <w:b/>
-          <w:bCs/>
-          <w:color w:val="FF0000"/>
-          <w:sz w:val="22"/>
-          <w:szCs w:val="22"/>
-        </w:rPr>
-        <w:t>)</w:t>
-      </w:r>
-    </w:p>
-    <w:p>
-      <w:pPr>
-        <w:rPr>
-          <w:sz w:val="22"/>
-          <w:szCs w:val="22"/>
-        </w:rPr>
-      </w:pPr>
-    </w:p>
-    <w:p>
-      <w:pPr>
-        <w:rPr>
-          <w:bCs/>
+    </w:p>
+    <w:p>
+      <w:pPr>
+        <w:rPr>
           <w:color w:val="0000FF"/>
           <w:sz w:val="22"/>
           <w:szCs w:val="22"/>
@@ -3091,77 +3641,29 @@
       </w:pPr>
       <w:r>
         <w:rPr>
-          <w:b/>
-          <w:bCs/>
           <w:color w:val="0000FF"/>
           <w:sz w:val="22"/>
           <w:szCs w:val="22"/>
-          <w:u w:val="single"/>
-        </w:rPr>
-        <w:t>Bugs Bunny Blunders a Bishop Swiss: September 4, 11, 18, 25</w:t>
-      </w:r>
-    </w:p>
-    <w:p>
-      <w:pPr>
+        </w:rPr>
+        <w:t>4-Round Swiss in Two Sections (Open and U1600).  Game/</w:t>
+      </w:r>
+      <w:proofErr w:type="gramStart"/>
+      <w:r>
         <w:rPr>
           <w:color w:val="0000FF"/>
           <w:sz w:val="22"/>
           <w:szCs w:val="22"/>
         </w:rPr>
-      </w:pPr>
+        <w:t>90;d</w:t>
+      </w:r>
+      <w:proofErr w:type="gramEnd"/>
       <w:r>
         <w:rPr>
           <w:color w:val="0000FF"/>
           <w:sz w:val="22"/>
           <w:szCs w:val="22"/>
         </w:rPr>
-        <w:t xml:space="preserve">4-Round Swiss in Two Sections (Open and U1600).  Game/90;d5.  USCF Rated.  EF:  $10.00.  (One ½-point bye available for any round (except round four) if requested at least 2-days prior to round).  TD is Wainscott; ATD is Grochowski  </w:t>
-      </w:r>
-    </w:p>
-    <w:p>
-      <w:pPr>
-        <w:rPr>
-          <w:sz w:val="22"/>
-          <w:szCs w:val="22"/>
-        </w:rPr>
-      </w:pPr>
-    </w:p>
-    <w:p>
-      <w:pPr>
-        <w:rPr>
-          <w:b/>
-          <w:color w:val="385623" w:themeColor="accent6" w:themeShade="80"/>
-          <w:sz w:val="22"/>
-          <w:szCs w:val="22"/>
-          <w:u w:val="single"/>
-        </w:rPr>
-      </w:pPr>
-      <w:r>
-        <w:rPr>
-          <w:b/>
-          <w:color w:val="385623" w:themeColor="accent6" w:themeShade="80"/>
-          <w:sz w:val="22"/>
-          <w:szCs w:val="22"/>
-          <w:u w:val="single"/>
-        </w:rPr>
-        <w:t>Speedy Gonzalez Action Swiss: October 2</w:t>
-      </w:r>
-    </w:p>
-    <w:p>
-      <w:pPr>
-        <w:rPr>
-          <w:color w:val="385623" w:themeColor="accent6" w:themeShade="80"/>
-          <w:sz w:val="22"/>
-          <w:szCs w:val="22"/>
-        </w:rPr>
-      </w:pPr>
-      <w:r>
-        <w:rPr>
-          <w:color w:val="385623" w:themeColor="accent6" w:themeShade="80"/>
-          <w:sz w:val="22"/>
-          <w:szCs w:val="22"/>
-        </w:rPr>
-        <w:t>3-round Swiss in two sections (G/25;d5 and G/24;d5). G25;d5 is dual-rated (regular and quick rated); G24;d5 is quick rated only.  EF: $5.00.  TD is Becker; ATC is Grochowski.</w:t>
+        <w:t xml:space="preserve">5.  USCF Rated.  EF:  $10.00.  (One ½-point bye available for any round (except round four) if requested at least 2-days prior to round).  TD is Wainscott; ATD is Grochowski  </w:t>
       </w:r>
     </w:p>
     <w:p>
@@ -3241,10 +3743,19 @@
       </w:pPr>
       <w:r>
         <w:rPr>
+          <w:b/>
+          <w:bCs/>
           <w:sz w:val="22"/>
           <w:szCs w:val="22"/>
         </w:rPr>
         <w:t>A Wisconsin Tour Event</w:t>
+      </w:r>
+      <w:r>
+        <w:rPr>
+          <w:sz w:val="22"/>
+          <w:szCs w:val="22"/>
+        </w:rPr>
+        <w:t xml:space="preserve"> </w:t>
       </w:r>
     </w:p>
     <w:p>
@@ -3328,7 +3839,23 @@
           <w:sz w:val="22"/>
           <w:szCs w:val="22"/>
         </w:rPr>
-        <w:t>ENTRY FEE:  $50 – Open;  $40 – Reserve</w:t>
+        <w:t xml:space="preserve">ENTRY FEE:  $50 – </w:t>
+      </w:r>
+      <w:proofErr w:type="gramStart"/>
+      <w:r>
+        <w:rPr>
+          <w:sz w:val="22"/>
+          <w:szCs w:val="22"/>
+        </w:rPr>
+        <w:t>Open;  $</w:t>
+      </w:r>
+      <w:proofErr w:type="gramEnd"/>
+      <w:r>
+        <w:rPr>
+          <w:sz w:val="22"/>
+          <w:szCs w:val="22"/>
+        </w:rPr>
+        <w:t>40 – Reserve</w:t>
       </w:r>
     </w:p>
     <w:p>
@@ -3437,38 +3964,34 @@
           <w:bottom w:val="single" w:sz="4" w:space="1" w:color="auto"/>
           <w:right w:val="single" w:sz="4" w:space="4" w:color="auto"/>
         </w:pBdr>
-        <w:rPr>
-          <w:b/>
-          <w:bCs/>
-          <w:sz w:val="22"/>
-          <w:szCs w:val="22"/>
-        </w:rPr>
-      </w:pPr>
-      <w:r>
-        <w:rPr>
-          <w:b/>
-          <w:bCs/>
-          <w:sz w:val="22"/>
-          <w:szCs w:val="22"/>
-        </w:rPr>
-        <w:t>More info, and to register:</w:t>
-      </w:r>
-    </w:p>
-    <w:p>
-      <w:pPr>
-        <w:pBdr>
-          <w:top w:val="single" w:sz="4" w:space="1" w:color="auto"/>
-          <w:left w:val="single" w:sz="4" w:space="4" w:color="auto"/>
-          <w:bottom w:val="single" w:sz="4" w:space="1" w:color="auto"/>
-          <w:right w:val="single" w:sz="4" w:space="4" w:color="auto"/>
-        </w:pBdr>
-        <w:rPr>
-          <w:b/>
-          <w:bCs/>
-          <w:sz w:val="22"/>
-          <w:szCs w:val="22"/>
-        </w:rPr>
-      </w:pPr>
+      </w:pPr>
+      <w:r>
+        <w:rPr>
+          <w:b/>
+          <w:bCs/>
+          <w:sz w:val="22"/>
+          <w:szCs w:val="22"/>
+        </w:rPr>
+        <w:t>Reg</w:t>
+      </w:r>
+      <w:r>
+        <w:rPr>
+          <w:b/>
+          <w:bCs/>
+          <w:sz w:val="22"/>
+          <w:szCs w:val="22"/>
+        </w:rPr>
+        <w:t>:</w:t>
+      </w:r>
+      <w:r>
+        <w:rPr>
+          <w:b/>
+          <w:bCs/>
+          <w:sz w:val="22"/>
+          <w:szCs w:val="22"/>
+        </w:rPr>
+        <w:t xml:space="preserve"> </w:t>
+      </w:r>
       <w:hyperlink r:id="rId7" w:history="1">
         <w:r>
           <w:rPr>
@@ -3484,6 +4007,46 @@
     </w:p>
     <w:p>
       <w:pPr>
+        <w:pBdr>
+          <w:top w:val="single" w:sz="4" w:space="1" w:color="auto"/>
+          <w:left w:val="single" w:sz="4" w:space="4" w:color="auto"/>
+          <w:bottom w:val="single" w:sz="4" w:space="1" w:color="auto"/>
+          <w:right w:val="single" w:sz="4" w:space="4" w:color="auto"/>
+        </w:pBdr>
+        <w:rPr>
+          <w:b/>
+          <w:bCs/>
+          <w:sz w:val="22"/>
+          <w:szCs w:val="22"/>
+        </w:rPr>
+      </w:pPr>
+    </w:p>
+    <w:p>
+      <w:pPr>
+        <w:rPr>
+          <w:b/>
+          <w:bCs/>
+          <w:color w:val="7030A0"/>
+          <w:sz w:val="22"/>
+          <w:szCs w:val="22"/>
+          <w:u w:val="single"/>
+        </w:rPr>
+      </w:pPr>
+    </w:p>
+    <w:p>
+      <w:pPr>
+        <w:rPr>
+          <w:b/>
+          <w:bCs/>
+          <w:color w:val="7030A0"/>
+          <w:sz w:val="22"/>
+          <w:szCs w:val="22"/>
+          <w:u w:val="single"/>
+        </w:rPr>
+      </w:pPr>
+    </w:p>
+    <w:p>
+      <w:pPr>
         <w:rPr>
           <w:b/>
           <w:bCs/>
@@ -3503,24 +4066,160 @@
           <w:u w:val="single"/>
         </w:rPr>
         <w:lastRenderedPageBreak/>
-        <w:t>Garfield Gambits a Pawn Swiss: October 9, 16, 23, 30 &amp; November 6</w:t>
-      </w:r>
-    </w:p>
-    <w:p>
-      <w:pPr>
-        <w:rPr>
-          <w:color w:val="7030A0"/>
-          <w:sz w:val="22"/>
-          <w:szCs w:val="22"/>
-        </w:rPr>
-      </w:pPr>
-      <w:r>
-        <w:rPr>
-          <w:color w:val="7030A0"/>
-          <w:sz w:val="22"/>
-          <w:szCs w:val="22"/>
-        </w:rPr>
-        <w:t xml:space="preserve">5-Round Swiss in Two Sections (Open and U1600).  Game/90;d5.  USCF Rated.  EF:  $10.00.  (One ½-point bye available for any round (except round five) if requested at least 2-days prior to round) TD is Grochowski; ATD is Wainscott  </w:t>
+        <w:t xml:space="preserve">Garfield Gambits a Pawn Swiss: </w:t>
+      </w:r>
+      <w:r>
+        <w:rPr>
+          <w:b/>
+          <w:bCs/>
+          <w:color w:val="7030A0"/>
+          <w:sz w:val="22"/>
+          <w:szCs w:val="22"/>
+          <w:u w:val="single"/>
+        </w:rPr>
+        <w:t xml:space="preserve">November </w:t>
+      </w:r>
+      <w:r>
+        <w:rPr>
+          <w:b/>
+          <w:bCs/>
+          <w:color w:val="7030A0"/>
+          <w:sz w:val="22"/>
+          <w:szCs w:val="22"/>
+          <w:u w:val="single"/>
+        </w:rPr>
+        <w:t>6</w:t>
+      </w:r>
+      <w:r>
+        <w:rPr>
+          <w:b/>
+          <w:bCs/>
+          <w:color w:val="7030A0"/>
+          <w:sz w:val="22"/>
+          <w:szCs w:val="22"/>
+          <w:u w:val="single"/>
+        </w:rPr>
+        <w:t xml:space="preserve">, </w:t>
+      </w:r>
+      <w:r>
+        <w:rPr>
+          <w:b/>
+          <w:bCs/>
+          <w:color w:val="7030A0"/>
+          <w:sz w:val="22"/>
+          <w:szCs w:val="22"/>
+          <w:u w:val="single"/>
+        </w:rPr>
+        <w:t>1</w:t>
+      </w:r>
+      <w:r>
+        <w:rPr>
+          <w:b/>
+          <w:bCs/>
+          <w:color w:val="7030A0"/>
+          <w:sz w:val="22"/>
+          <w:szCs w:val="22"/>
+          <w:u w:val="single"/>
+        </w:rPr>
+        <w:t>3</w:t>
+      </w:r>
+      <w:r>
+        <w:rPr>
+          <w:b/>
+          <w:bCs/>
+          <w:color w:val="7030A0"/>
+          <w:sz w:val="22"/>
+          <w:szCs w:val="22"/>
+          <w:u w:val="single"/>
+        </w:rPr>
+        <w:t>, 20</w:t>
+      </w:r>
+      <w:r>
+        <w:rPr>
+          <w:b/>
+          <w:bCs/>
+          <w:color w:val="7030A0"/>
+          <w:sz w:val="22"/>
+          <w:szCs w:val="22"/>
+          <w:u w:val="single"/>
+        </w:rPr>
+        <w:t xml:space="preserve"> &amp; </w:t>
+      </w:r>
+      <w:r>
+        <w:rPr>
+          <w:b/>
+          <w:bCs/>
+          <w:color w:val="7030A0"/>
+          <w:sz w:val="22"/>
+          <w:szCs w:val="22"/>
+          <w:u w:val="single"/>
+        </w:rPr>
+        <w:t>Dec</w:t>
+      </w:r>
+      <w:r>
+        <w:rPr>
+          <w:b/>
+          <w:bCs/>
+          <w:color w:val="7030A0"/>
+          <w:sz w:val="22"/>
+          <w:szCs w:val="22"/>
+          <w:u w:val="single"/>
+        </w:rPr>
+        <w:t xml:space="preserve">ember </w:t>
+      </w:r>
+      <w:r>
+        <w:rPr>
+          <w:b/>
+          <w:bCs/>
+          <w:color w:val="7030A0"/>
+          <w:sz w:val="22"/>
+          <w:szCs w:val="22"/>
+          <w:u w:val="single"/>
+        </w:rPr>
+        <w:t>4</w:t>
+      </w:r>
+    </w:p>
+    <w:p>
+      <w:pPr>
+        <w:rPr>
+          <w:color w:val="7030A0"/>
+          <w:sz w:val="22"/>
+          <w:szCs w:val="22"/>
+        </w:rPr>
+      </w:pPr>
+      <w:r>
+        <w:rPr>
+          <w:color w:val="7030A0"/>
+          <w:sz w:val="22"/>
+          <w:szCs w:val="22"/>
+        </w:rPr>
+        <w:t>4</w:t>
+      </w:r>
+      <w:r>
+        <w:rPr>
+          <w:color w:val="7030A0"/>
+          <w:sz w:val="22"/>
+          <w:szCs w:val="22"/>
+        </w:rPr>
+        <w:t>-Round Swiss in Two Sections (Open and U1600).  Game/</w:t>
+      </w:r>
+      <w:proofErr w:type="gramStart"/>
+      <w:r>
+        <w:rPr>
+          <w:color w:val="7030A0"/>
+          <w:sz w:val="22"/>
+          <w:szCs w:val="22"/>
+        </w:rPr>
+        <w:t>90;d</w:t>
+      </w:r>
+      <w:proofErr w:type="gramEnd"/>
+      <w:r>
+        <w:rPr>
+          <w:color w:val="7030A0"/>
+          <w:sz w:val="22"/>
+          <w:szCs w:val="22"/>
+        </w:rPr>
+        <w:t xml:space="preserve">5.  USCF Rated.  EF:  $10.00.  (One ½-point bye available for any round (except round five) if requested at least 2-days prior to round) TD is Grochowski; ATD is Wainscott  </w:t>
       </w:r>
     </w:p>
     <w:p>
@@ -3563,54 +4262,95 @@
           <w:szCs w:val="22"/>
           <w:u w:val="single"/>
         </w:rPr>
-        <w:t xml:space="preserve"> Swiss: November 13, 20</w:t>
-      </w:r>
-      <w:r>
-        <w:rPr>
-          <w:b/>
-          <w:bCs/>
+        <w:t xml:space="preserve"> Swiss: December 11, 18</w:t>
+      </w:r>
+      <w:r>
+        <w:rPr>
+          <w:b/>
+          <w:bCs/>
+          <w:color w:val="0000FF"/>
+          <w:sz w:val="22"/>
+          <w:szCs w:val="22"/>
+          <w:u w:val="single"/>
+        </w:rPr>
+        <w:t xml:space="preserve"> &amp; January 8, 15</w:t>
+      </w:r>
+    </w:p>
+    <w:p>
+      <w:pPr>
+        <w:rPr>
+          <w:color w:val="0000FF"/>
+          <w:sz w:val="22"/>
+          <w:szCs w:val="22"/>
+        </w:rPr>
+      </w:pPr>
+      <w:r>
+        <w:rPr>
+          <w:color w:val="0000FF"/>
+          <w:sz w:val="22"/>
+          <w:szCs w:val="22"/>
+        </w:rPr>
+        <w:t>4</w:t>
+      </w:r>
+      <w:r>
+        <w:rPr>
+          <w:color w:val="0000FF"/>
+          <w:sz w:val="22"/>
+          <w:szCs w:val="22"/>
+        </w:rPr>
+        <w:t>-Round Swiss in Two Sections (Open and U1600).  Game/</w:t>
+      </w:r>
+      <w:proofErr w:type="gramStart"/>
+      <w:r>
+        <w:rPr>
+          <w:color w:val="0000FF"/>
+          <w:sz w:val="22"/>
+          <w:szCs w:val="22"/>
+        </w:rPr>
+        <w:t>90;d</w:t>
+      </w:r>
+      <w:proofErr w:type="gramEnd"/>
+      <w:r>
+        <w:rPr>
+          <w:color w:val="0000FF"/>
+          <w:sz w:val="22"/>
+          <w:szCs w:val="22"/>
+        </w:rPr>
+        <w:t xml:space="preserve">5.  USCF Rated.  EF:  $10.00.  (One ½-point bye available for any round (except round five) if requested at least 2-days prior to round) TD is Wainscott; ATD is </w:t>
+      </w:r>
+      <w:proofErr w:type="gramStart"/>
+      <w:r>
+        <w:rPr>
+          <w:color w:val="0000FF"/>
+          <w:sz w:val="22"/>
+          <w:szCs w:val="22"/>
+        </w:rPr>
+        <w:t xml:space="preserve">Grochowski  </w:t>
+      </w:r>
+      <w:r>
+        <w:rPr>
           <w:color w:val="C00000"/>
           <w:sz w:val="22"/>
           <w:szCs w:val="22"/>
-          <w:u w:val="single"/>
+        </w:rPr>
+        <w:t>(</w:t>
+      </w:r>
+      <w:proofErr w:type="gramEnd"/>
+      <w:r>
+        <w:rPr>
+          <w:color w:val="C00000"/>
+          <w:sz w:val="22"/>
+          <w:szCs w:val="22"/>
         </w:rPr>
         <w:t>*</w:t>
       </w:r>
       <w:r>
         <w:rPr>
-          <w:b/>
-          <w:bCs/>
-          <w:color w:val="0000FF"/>
-          <w:sz w:val="22"/>
-          <w:szCs w:val="22"/>
-          <w:u w:val="single"/>
-        </w:rPr>
-        <w:t xml:space="preserve"> &amp; December 4, 11, 18</w:t>
-      </w:r>
-    </w:p>
-    <w:p>
-      <w:pPr>
-        <w:rPr>
-          <w:color w:val="0000FF"/>
-          <w:sz w:val="22"/>
-          <w:szCs w:val="22"/>
-        </w:rPr>
-      </w:pPr>
-      <w:r>
-        <w:rPr>
-          <w:color w:val="0000FF"/>
-          <w:sz w:val="22"/>
-          <w:szCs w:val="22"/>
-        </w:rPr>
-        <w:t xml:space="preserve">5-Round Swiss in Two Sections (Open and U1600).  Game/90;d5.  USCF Rated.  EF:  $10.00.  (One ½-point bye available for any round (except round five) if requested at least 2-days prior to round) TD is Wainscott; ATD is Grochowski  </w:t>
-      </w:r>
-      <w:r>
-        <w:rPr>
           <w:color w:val="C00000"/>
           <w:sz w:val="22"/>
           <w:szCs w:val="22"/>
         </w:rPr>
-        <w:t>(</w:t>
+        <w:t xml:space="preserve">no chess </w:t>
       </w:r>
       <w:r>
         <w:rPr>
@@ -3618,7 +4358,7 @@
           <w:sz w:val="22"/>
           <w:szCs w:val="22"/>
         </w:rPr>
-        <w:t>*</w:t>
+        <w:t>Dec</w:t>
       </w:r>
       <w:r>
         <w:rPr>
@@ -3626,39 +4366,35 @@
           <w:sz w:val="22"/>
           <w:szCs w:val="22"/>
         </w:rPr>
-        <w:t>no chess Nov. 27)</w:t>
-      </w:r>
-    </w:p>
-    <w:p>
-      <w:pPr>
-        <w:rPr>
-          <w:sz w:val="22"/>
-          <w:szCs w:val="22"/>
-        </w:rPr>
-      </w:pPr>
-    </w:p>
-    <w:p>
-      <w:pPr>
-        <w:rPr>
-          <w:b/>
-          <w:bCs/>
+        <w:t>. 2</w:t>
+      </w:r>
+      <w:r>
+        <w:rPr>
           <w:color w:val="C00000"/>
           <w:sz w:val="22"/>
           <w:szCs w:val="22"/>
         </w:rPr>
-      </w:pPr>
-    </w:p>
-    <w:p>
-      <w:pPr>
-        <w:rPr>
-          <w:b/>
-          <w:bCs/>
+        <w:t>5 or Jan. 1</w:t>
+      </w:r>
+      <w:r>
+        <w:rPr>
           <w:color w:val="C00000"/>
           <w:sz w:val="22"/>
           <w:szCs w:val="22"/>
         </w:rPr>
-      </w:pPr>
-      <w:r>
+        <w:t>)</w:t>
+      </w:r>
+    </w:p>
+    <w:p>
+      <w:pPr>
+        <w:rPr>
+          <w:sz w:val="22"/>
+          <w:szCs w:val="22"/>
+        </w:rPr>
+      </w:pPr>
+    </w:p>
+    <w:p>
+      <w:pPr>
         <w:rPr>
           <w:b/>
           <w:bCs/>
@@ -3666,6 +4402,26 @@
           <w:sz w:val="22"/>
           <w:szCs w:val="22"/>
         </w:rPr>
+      </w:pPr>
+    </w:p>
+    <w:p>
+      <w:pPr>
+        <w:rPr>
+          <w:b/>
+          <w:bCs/>
+          <w:color w:val="C00000"/>
+          <w:sz w:val="22"/>
+          <w:szCs w:val="22"/>
+        </w:rPr>
+      </w:pPr>
+      <w:r>
+        <w:rPr>
+          <w:b/>
+          <w:bCs/>
+          <w:color w:val="C00000"/>
+          <w:sz w:val="22"/>
+          <w:szCs w:val="22"/>
+        </w:rPr>
         <w:t>NO chess on Thanksgiving (November 27)</w:t>
       </w:r>
     </w:p>
@@ -3709,7 +4465,28 @@
           <w:sz w:val="22"/>
           <w:szCs w:val="22"/>
         </w:rPr>
-        <w:t>No chess on Christmas or New Years Day (December 25 &amp; January 1)</w:t>
+        <w:t xml:space="preserve">No chess on Christmas or New Years Day </w:t>
+      </w:r>
+    </w:p>
+    <w:p>
+      <w:pPr>
+        <w:rPr>
+          <w:b/>
+          <w:bCs/>
+          <w:color w:val="C00000"/>
+          <w:sz w:val="22"/>
+          <w:szCs w:val="22"/>
+        </w:rPr>
+      </w:pPr>
+      <w:r>
+        <w:rPr>
+          <w:b/>
+          <w:bCs/>
+          <w:color w:val="C00000"/>
+          <w:sz w:val="22"/>
+          <w:szCs w:val="22"/>
+        </w:rPr>
+        <w:t>(December 25 &amp; January 1)</w:t>
       </w:r>
     </w:p>
     <w:p>
@@ -4841,7 +5618,43 @@
           <w:sz w:val="20"/>
           <w:szCs w:val="20"/>
         </w:rPr>
-        <w:t>August 3</w:t>
+        <w:t>September</w:t>
+      </w:r>
+      <w:r>
+        <w:rPr>
+          <w:i/>
+          <w:iCs/>
+          <w:color w:val="205768"/>
+          <w:spacing w:val="-14"/>
+          <w:w w:val="115"/>
+          <w:sz w:val="20"/>
+          <w:szCs w:val="20"/>
+        </w:rPr>
+        <w:t xml:space="preserve"> </w:t>
+      </w:r>
+      <w:r>
+        <w:rPr>
+          <w:i/>
+          <w:iCs/>
+          <w:color w:val="205768"/>
+          <w:spacing w:val="-14"/>
+          <w:w w:val="115"/>
+          <w:sz w:val="20"/>
+          <w:szCs w:val="20"/>
+        </w:rPr>
+        <w:t>1</w:t>
+      </w:r>
+      <w:r>
+        <w:rPr>
+          <w:i/>
+          <w:iCs/>
+          <w:color w:val="205768"/>
+          <w:spacing w:val="-14"/>
+          <w:w w:val="115"/>
+          <w:sz w:val="20"/>
+          <w:szCs w:val="20"/>
+        </w:rPr>
+        <w:t>0</w:t>
       </w:r>
       <w:r>
         <w:rPr>
@@ -5241,6 +6054,120 @@
     </w:lvl>
   </w:abstractNum>
   <w:abstractNum w:abstractNumId="3" w15:restartNumberingAfterBreak="0">
+    <w:nsid w:val="47007C0D"/>
+    <w:multiLevelType w:val="hybridMultilevel"/>
+    <w:tmpl w:val="36A60A08"/>
+    <w:lvl w:ilvl="0" w:tplc="F5A8E754">
+      <w:start w:val="608"/>
+      <w:numFmt w:val="bullet"/>
+      <w:lvlText w:val=""/>
+      <w:lvlJc w:val="left"/>
+      <w:pPr>
+        <w:ind w:left="720" w:hanging="360"/>
+      </w:pPr>
+      <w:rPr>
+        <w:rFonts w:ascii="Wingdings" w:eastAsiaTheme="minorEastAsia" w:hAnsi="Wingdings" w:cs="Times New Roman" w:hint="default"/>
+        <w:color w:val="auto"/>
+      </w:rPr>
+    </w:lvl>
+    <w:lvl w:ilvl="1" w:tplc="04090003" w:tentative="1">
+      <w:start w:val="1"/>
+      <w:numFmt w:val="bullet"/>
+      <w:lvlText w:val="o"/>
+      <w:lvlJc w:val="left"/>
+      <w:pPr>
+        <w:ind w:left="1440" w:hanging="360"/>
+      </w:pPr>
+      <w:rPr>
+        <w:rFonts w:ascii="Courier New" w:hAnsi="Courier New" w:cs="Courier New" w:hint="default"/>
+      </w:rPr>
+    </w:lvl>
+    <w:lvl w:ilvl="2" w:tplc="04090005" w:tentative="1">
+      <w:start w:val="1"/>
+      <w:numFmt w:val="bullet"/>
+      <w:lvlText w:val=""/>
+      <w:lvlJc w:val="left"/>
+      <w:pPr>
+        <w:ind w:left="2160" w:hanging="360"/>
+      </w:pPr>
+      <w:rPr>
+        <w:rFonts w:ascii="Wingdings" w:hAnsi="Wingdings" w:hint="default"/>
+      </w:rPr>
+    </w:lvl>
+    <w:lvl w:ilvl="3" w:tplc="04090001" w:tentative="1">
+      <w:start w:val="1"/>
+      <w:numFmt w:val="bullet"/>
+      <w:lvlText w:val=""/>
+      <w:lvlJc w:val="left"/>
+      <w:pPr>
+        <w:ind w:left="2880" w:hanging="360"/>
+      </w:pPr>
+      <w:rPr>
+        <w:rFonts w:ascii="Symbol" w:hAnsi="Symbol" w:hint="default"/>
+      </w:rPr>
+    </w:lvl>
+    <w:lvl w:ilvl="4" w:tplc="04090003" w:tentative="1">
+      <w:start w:val="1"/>
+      <w:numFmt w:val="bullet"/>
+      <w:lvlText w:val="o"/>
+      <w:lvlJc w:val="left"/>
+      <w:pPr>
+        <w:ind w:left="3600" w:hanging="360"/>
+      </w:pPr>
+      <w:rPr>
+        <w:rFonts w:ascii="Courier New" w:hAnsi="Courier New" w:cs="Courier New" w:hint="default"/>
+      </w:rPr>
+    </w:lvl>
+    <w:lvl w:ilvl="5" w:tplc="04090005" w:tentative="1">
+      <w:start w:val="1"/>
+      <w:numFmt w:val="bullet"/>
+      <w:lvlText w:val=""/>
+      <w:lvlJc w:val="left"/>
+      <w:pPr>
+        <w:ind w:left="4320" w:hanging="360"/>
+      </w:pPr>
+      <w:rPr>
+        <w:rFonts w:ascii="Wingdings" w:hAnsi="Wingdings" w:hint="default"/>
+      </w:rPr>
+    </w:lvl>
+    <w:lvl w:ilvl="6" w:tplc="04090001" w:tentative="1">
+      <w:start w:val="1"/>
+      <w:numFmt w:val="bullet"/>
+      <w:lvlText w:val=""/>
+      <w:lvlJc w:val="left"/>
+      <w:pPr>
+        <w:ind w:left="5040" w:hanging="360"/>
+      </w:pPr>
+      <w:rPr>
+        <w:rFonts w:ascii="Symbol" w:hAnsi="Symbol" w:hint="default"/>
+      </w:rPr>
+    </w:lvl>
+    <w:lvl w:ilvl="7" w:tplc="04090003" w:tentative="1">
+      <w:start w:val="1"/>
+      <w:numFmt w:val="bullet"/>
+      <w:lvlText w:val="o"/>
+      <w:lvlJc w:val="left"/>
+      <w:pPr>
+        <w:ind w:left="5760" w:hanging="360"/>
+      </w:pPr>
+      <w:rPr>
+        <w:rFonts w:ascii="Courier New" w:hAnsi="Courier New" w:cs="Courier New" w:hint="default"/>
+      </w:rPr>
+    </w:lvl>
+    <w:lvl w:ilvl="8" w:tplc="04090005" w:tentative="1">
+      <w:start w:val="1"/>
+      <w:numFmt w:val="bullet"/>
+      <w:lvlText w:val=""/>
+      <w:lvlJc w:val="left"/>
+      <w:pPr>
+        <w:ind w:left="6480" w:hanging="360"/>
+      </w:pPr>
+      <w:rPr>
+        <w:rFonts w:ascii="Wingdings" w:hAnsi="Wingdings" w:hint="default"/>
+      </w:rPr>
+    </w:lvl>
+  </w:abstractNum>
+  <w:abstractNum w:abstractNumId="4" w15:restartNumberingAfterBreak="0">
     <w:nsid w:val="4707153A"/>
     <w:multiLevelType w:val="hybridMultilevel"/>
     <w:tmpl w:val="F14C7C40"/>
@@ -5353,7 +6280,7 @@
       </w:rPr>
     </w:lvl>
   </w:abstractNum>
-  <w:abstractNum w:abstractNumId="4" w15:restartNumberingAfterBreak="0">
+  <w:abstractNum w:abstractNumId="5" w15:restartNumberingAfterBreak="0">
     <w:nsid w:val="52677867"/>
     <w:multiLevelType w:val="hybridMultilevel"/>
     <w:tmpl w:val="1610A580"/>
@@ -5466,19 +6393,22 @@
     </w:lvl>
   </w:abstractNum>
   <w:num w:numId="1" w16cid:durableId="2118865315">
-    <w:abstractNumId w:val="3"/>
+    <w:abstractNumId w:val="4"/>
   </w:num>
   <w:num w:numId="2" w16cid:durableId="1162550045">
     <w:abstractNumId w:val="1"/>
   </w:num>
   <w:num w:numId="3" w16cid:durableId="1050304160">
-    <w:abstractNumId w:val="4"/>
+    <w:abstractNumId w:val="5"/>
   </w:num>
   <w:num w:numId="4" w16cid:durableId="2027368807">
     <w:abstractNumId w:val="2"/>
   </w:num>
   <w:num w:numId="5" w16cid:durableId="2094817255">
     <w:abstractNumId w:val="0"/>
+  </w:num>
+  <w:num w:numId="6" w16cid:durableId="1021204565">
+    <w:abstractNumId w:val="3"/>
   </w:num>
 </w:numbering>
 </file>

</xml_diff>